<commit_message>
Add missing in-text citations for Figures 1-4 (AGU numerical-order rule)
</commit_message>
<xml_diff>
--- a/manuscript/paper_msl_2026.docx
+++ b/manuscript/paper_msl_2026.docx
@@ -951,7 +951,7 @@
           <w:sz w:val="24"/>
           <w:szCs w:val="24"/>
         </w:rPr>
-        <w:t>The total dose rate (measured by detector E) decreases as atmospheric pressure increases. This decrease is attributed to the increased shielding provided by the atmosphere as pressure rises. Conversely, the count rate for neutral particles increases with increasing pressure. This is a result of the production of secondary neutrals at altitudes above the Pfotzer maximum (Bazilevskaya &amp; Svirzhevskaya, 1998). This behavior contrasts with neutron monitors on Earth's surface, which are located below the Pfotzer maximum and record a lower neutron count rate when atmospheric pressure increases (Roesler et al., 1998).</w:t>
+        <w:t>The total dose rate (measured by detector E) decreases as atmospheric pressure increases (Figure 1). This decrease is attributed to the increased shielding provided by the atmosphere as pressure rises. Conversely, the count rate for neutral particles increases with increasing pressure. This is a result of the production of secondary neutrals at altitudes above the Pfotzer maximum (Bazilevskaya &amp; Svirzhevskaya, 1998). This behavior contrasts with neutron monitors on Earth's surface, which are located below the Pfotzer maximum and record a lower neutron count rate when atmospheric pressure increases (Roesler et al., 1998).</w:t>
       </w:r>
     </w:p>
     <w:p>
@@ -1015,6 +1015,9 @@
           <w:sz w:val="24"/>
           <w:szCs w:val="24"/>
         </w:rPr>
+      </w:r>
+      <w:r>
+        <w:t>For each of these ~90-sol windows, a continuous wavelet transform of the detector-E dose-rate time series was also computed (Section 2.3), shown in Figure 2 (SOL 00000-00804), Figure 3 (SOL 00805-01772), and Figure 4 (SOL 01773-02358). No window shows a stable, narrowband periodicity at the ~669-sol Martian-year timescale, consistent with the absence of a resolved seasonal cycle established directly in Section 3.3. The one notable feature is transient rather than periodic: panel A of Figure 4 (SOL 01773-01869) captures the September 2017 solar energetic particle event as a short-lived, broadband power excursion rather than a recurring seasonal signal.</w:t>
       </w:r>
     </w:p>
     <w:p>

</xml_diff>

<commit_message>
Fix broken equation rendering (missing m:sup collapsed nested nary content in LibreOffice/Word)
</commit_message>
<xml_diff>
--- a/manuscript/paper_msl_2026.docx
+++ b/manuscript/paper_msl_2026.docx
@@ -661,17 +661,20 @@
           <m:naryPr>
             <m:chr m:val="∑"/>
             <m:limLoc m:val="undOvr"/>
+            <m:supHide m:val="1"/>
           </m:naryPr>
           <m:sub>
             <m:r>
               <m:t>j</m:t>
             </m:r>
           </m:sub>
+          <m:sup/>
           <m:e>
             <m:nary>
               <m:naryPr>
                 <m:chr m:val="∑"/>
                 <m:limLoc m:val="undOvr"/>
+                <m:supHide m:val="1"/>
               </m:naryPr>
               <m:sub>
                 <m:r>
@@ -681,6 +684,7 @@
                   <m:t>area</m:t>
                 </m:r>
               </m:sub>
+              <m:sup/>
               <m:e>
                 <m:nary>
                   <m:naryPr>

</xml_diff>

<commit_message>
Cite the archived Zenodo deposit (DOI) instead of the plain GitHub link in Open Research/References
</commit_message>
<xml_diff>
--- a/manuscript/paper_msl_2026.docx
+++ b/manuscript/paper_msl_2026.docx
@@ -1978,7 +1978,7 @@
       </w:pPr>
       <w:r>
         <w:rPr/>
-        <w:t>Raw RAD and REMS data are publicly archived at NASA's Planetary Data System (RAD: Planetary Plasma Interactions Node, 2026; REMS: Atmospheres Node, 2026). Oulu neutron monitor data are from the Neutron Monitor Database (NMDB, https://www.nmdb.eu; Mavromichalaki et al., 2011); observed sunspot numbers are from the SILSO World Data Center (2026). The extraction pipeline, derived per-sol dose and pressure series, and all analysis code used in this paper are openly available at Amaral (2026).</w:t>
+        <w:t>Raw RAD and REMS data are publicly archived at NASA's Planetary Data System (RAD: Planetary Plasma Interactions Node, 2026; REMS: Atmospheres Node, 2026). Oulu neutron monitor data are from the Neutron Monitor Database (NMDB, https://www.nmdb.eu; Mavromichalaki et al., 2011); observed sunspot numbers are from the SILSO World Data Center (2026). The extraction pipeline, derived per-sol dose and pressure series, and all analysis code used in this paper are openly available at Amaral et al. (2026).</w:t>
       </w:r>
     </w:p>
     <w:p>
@@ -2030,17 +2030,17 @@
       </w:pPr>
       <w:r>
         <w:rPr/>
-        <w:t xml:space="preserve">Amaral, C. (2026). </w:t>
+        <w:t xml:space="preserve">Amaral, C., Abreu dos Anjos, D. A., Santos Donato, A. L., &amp; Bastos Eller, L. (2026). </w:t>
       </w:r>
       <w:r>
         <w:rPr>
           <w:i/>
         </w:rPr>
-        <w:t>msl_2026: MSL/RAD dose-rate reanalysis code [Software]</w:t>
-      </w:r>
-      <w:r>
-        <w:rPr/>
-        <w:t>. GitHub. https://github.com/cesarrlamaral/msl_2026</w:t>
+        <w:t>msl_2026: MSL/RAD dose-rate reanalysis code and data</w:t>
+      </w:r>
+      <w:r>
+        <w:rPr/>
+        <w:t xml:space="preserve"> [Software]. Zenodo. https://doi.org/10.5281/zenodo.22550046</w:t>
       </w:r>
     </w:p>
     <w:p>

</xml_diff>

<commit_message>
Add corresponding author ORCID; state no dedicated funding; confirm no conflicts of interest
</commit_message>
<xml_diff>
--- a/manuscript/paper_msl_2026.docx
+++ b/manuscript/paper_msl_2026.docx
@@ -113,7 +113,7 @@
       </w:r>
       <w:r>
         <w:rPr/>
-        <w:t>Corresponding author: Cesar Amaral (cesar.amaral@uerj.br)</w:t>
+        <w:t>Corresponding author: Cesar Amaral (cesar.amaral@uerj.br; ORCID: https://orcid.org/0000-0002-4314-3517)</w:t>
       </w:r>
     </w:p>
     <w:p>
@@ -1946,7 +1946,7 @@
       </w:pPr>
       <w:r>
         <w:rPr/>
-        <w:t>[FUNDING INFORMATION TO BE ADDED BY THE AUTHORS: list all funding sources for this work, including grant and funder identifiers, or state that the work received no dedicated external funding.]</w:t>
+        <w:t>This research received no specific grant or external funding from any agency in the public, commercial, or not-for-profit sectors.</w:t>
       </w:r>
     </w:p>
     <w:p>

</xml_diff>

<commit_message>
Add Rodrigo Goldenberg-Barbosa as 5th manuscript co-author
</commit_message>
<xml_diff>
--- a/manuscript/paper_msl_2026.docx
+++ b/manuscript/paper_msl_2026.docx
@@ -68,7 +68,16 @@
       </w:r>
       <w:r>
         <w:rPr/>
-        <w:t>, and Leticia Bastos Eller</w:t>
+        <w:t>, Leticia Bastos Eller</w:t>
+      </w:r>
+      <w:r>
+        <w:rPr>
+          <w:vertAlign w:val="superscript"/>
+        </w:rPr>
+        <w:t>1</w:t>
+      </w:r>
+      <w:r>
+        <w:t>, and Rodrigo Goldenberg-Barbosa</w:t>
       </w:r>
       <w:r>
         <w:rPr>

</xml_diff>

<commit_message>
Add ORCID iDs for all 5 authors on the title page
</commit_message>
<xml_diff>
--- a/manuscript/paper_msl_2026.docx
+++ b/manuscript/paper_msl_2026.docx
@@ -122,7 +122,17 @@
       </w:r>
       <w:r>
         <w:rPr/>
-        <w:t>Corresponding author: Cesar Amaral (cesar.amaral@uerj.br; ORCID: https://orcid.org/0000-0002-4314-3517)</w:t>
+        <w:t>Corresponding author: Cesar Amaral (cesar.amaral@uerj.br)</w:t>
+      </w:r>
+    </w:p>
+    <w:p>
+      <w:pPr>
+        <w:pStyle w:val="Normal"/>
+        <w:spacing w:lineRule="auto" w:line="480"/>
+        <w:rPr/>
+      </w:pPr>
+      <w:r>
+        <w:t>ORCID iDs: Cesar Amaral, https://orcid.org/0000-0002-4314-3517; Dafne Adriana Abreu dos Anjos, https://orcid.org/0000-0002-0769-2279; Anna Luisa dos Santos Donato, https://orcid.org/0000-0002-9286-8995; Leticia Bastos Eller, https://orcid.org/0000-0003-1524-5775; Rodrigo Goldenberg-Barbosa, https://orcid.org/0000-0002-4072-8608</w:t>
       </w:r>
     </w:p>
     <w:p>

</xml_diff>

<commit_message>
Remove Figure 1 (copied from Rafkin et al. 2014) for copyright reasons
JGR:Planets requires permission to reproduce copyrighted figures. The
diurnal-perturbation panel was a direct reproduction of Rafkin et al.'s
own published figure (their "Figure 5" label was still baked into the
image), not something generated from our own data -- and our extraction
pipeline never pulled sub-daily timestamps, so an equivalent from-scratch
figure using our own data was not readily reproducible. The diurnal
anti-correlation it illustrated is background context (Section 3.1), not
part of this paper's own findings, so it is safe to drop rather than
require new large-scale hourly-resolution extraction.

Renumbered Figures 2-9 to 1-8 throughout (captions, in-text citations,
and file names) to close the gap.
</commit_message>
<xml_diff>
--- a/manuscript/paper_msl_2026.docx
+++ b/manuscript/paper_msl_2026.docx
@@ -54,70 +54,101 @@
         <w:rPr>
           <w:vertAlign w:val="superscript"/>
         </w:rPr>
+        <w:t>1,2</w:t>
+      </w:r>
+      <w:r>
+        <w:rPr/>
+        <w:t>, Anna Luisa dos Santos Donato</w:t>
+      </w:r>
+      <w:r>
+        <w:rPr>
+          <w:vertAlign w:val="superscript"/>
+        </w:rPr>
+        <w:t>1,2</w:t>
+      </w:r>
+      <w:r>
+        <w:rPr/>
+        <w:t>, Leticia Bastos Eller</w:t>
+      </w:r>
+      <w:r>
+        <w:rPr>
+          <w:vertAlign w:val="superscript"/>
+        </w:rPr>
+        <w:t>1,2</w:t>
+      </w:r>
+      <w:r>
+        <w:rPr/>
+        <w:t>, and Rodrigo Goldenberg-Barbosa</w:t>
+      </w:r>
+      <w:r>
+        <w:rPr>
+          <w:vertAlign w:val="superscript"/>
+        </w:rPr>
         <w:t>1</w:t>
       </w:r>
       <w:r>
-        <w:rPr/>
-        <w:t>, Anna Luisa dos Santos Donato</w:t>
-      </w:r>
-      <w:r>
-        <w:rPr>
+        <w:rPr>
+          <w:sz w:val="24"/>
+          <w:szCs w:val="24"/>
           <w:vertAlign w:val="superscript"/>
         </w:rPr>
+        <w:t>,2</w:t>
+      </w:r>
+    </w:p>
+    <w:p>
+      <w:pPr>
+        <w:pStyle w:val="Normal"/>
+        <w:spacing w:lineRule="auto" w:line="480"/>
+        <w:jc w:val="both"/>
+        <w:rPr>
+          <w:rFonts w:ascii="Calibri" w:hAnsi="Calibri"/>
+          <w:sz w:val="24"/>
+          <w:szCs w:val="24"/>
+        </w:rPr>
+      </w:pPr>
+      <w:r>
+        <w:rPr>
+          <w:vertAlign w:val="superscript"/>
+        </w:rPr>
         <w:t>1</w:t>
       </w:r>
       <w:r>
         <w:rPr/>
-        <w:t>, Leticia Bastos Eller</w:t>
-      </w:r>
+        <w:t>Núcleo de Genética Molecular Ambiental e Astrobiologia, Departamento de Biofísica e Biometria, Instituto de Biologia Roberto Alcantara Gomes, Universidade do Estado do Rio de Janeiro (UERJ), Avenida São Francisco Xavier, 524, Maracanã, Pavilhão Haroldo Lisboa da Cunha, CEP 20550-900, Rio de Janeiro, RJ, Brazil</w:t>
+      </w:r>
+    </w:p>
+    <w:p>
+      <w:pPr>
+        <w:pStyle w:val="Normal"/>
+        <w:spacing w:lineRule="auto" w:line="480"/>
+        <w:jc w:val="both"/>
+        <w:rPr>
+          <w:rFonts w:ascii="Calibri" w:hAnsi="Calibri"/>
+          <w:sz w:val="24"/>
+          <w:szCs w:val="24"/>
+        </w:rPr>
+      </w:pPr>
       <w:r>
         <w:rPr>
           <w:vertAlign w:val="superscript"/>
         </w:rPr>
-        <w:t>1</w:t>
-      </w:r>
-      <w:r>
-        <w:t>, and Rodrigo Goldenberg-Barbosa</w:t>
-      </w:r>
+        <w:t>2</w:t>
+      </w:r>
+      <w:r>
+        <w:rPr/>
+        <w:t>Programa de Pós-Graduação em Ecologia e Evolução, Universidade do Estado do Rio de Janeiro (UERJ), Avenida São Francisco Xavier, 524, Maracanã, Pavilhão Haroldo Lisboa da Cunha, CEP 20550-900, Rio de Janeiro, RJ, Brazil</w:t>
+      </w:r>
+    </w:p>
+    <w:p>
+      <w:pPr>
+        <w:pStyle w:val="Normal"/>
+        <w:spacing w:lineRule="auto" w:line="480"/>
+        <w:rPr/>
+      </w:pPr>
       <w:r>
         <w:rPr>
           <w:vertAlign w:val="superscript"/>
         </w:rPr>
-        <w:t>1</w:t>
-      </w:r>
-    </w:p>
-    <w:p>
-      <w:pPr>
-        <w:pStyle w:val="Normal"/>
-        <w:spacing w:lineRule="auto" w:line="480"/>
-        <w:jc w:val="both"/>
-        <w:rPr>
-          <w:rFonts w:ascii="Calibri" w:hAnsi="Calibri"/>
-          <w:sz w:val="24"/>
-          <w:szCs w:val="24"/>
-        </w:rPr>
-      </w:pPr>
-      <w:r>
-        <w:rPr>
-          <w:vertAlign w:val="superscript"/>
-        </w:rPr>
-        <w:t>1</w:t>
-      </w:r>
-      <w:r>
-        <w:rPr/>
-        <w:t>Núcleo de Genética Molecular Ambiental e Astrobiologia, Departamento de Biofísica e Biometria, Instituto de Biologia Roberto Alcantara Gomes, Universidade do Estado do Rio de Janeiro (UERJ), Avenida São Francisco Xavier, 524, Maracanã, Pavilhão Haroldo Lisboa da Cunha, CEP 20550-900, Rio de Janeiro, RJ, Brazil</w:t>
-      </w:r>
-    </w:p>
-    <w:p>
-      <w:pPr>
-        <w:pStyle w:val="Normal"/>
-        <w:spacing w:lineRule="auto" w:line="480"/>
-        <w:rPr/>
-      </w:pPr>
-      <w:r>
-        <w:rPr>
-          <w:vertAlign w:val="superscript"/>
-        </w:rPr>
         <w:t>*</w:t>
       </w:r>
       <w:r>
@@ -132,6 +163,7 @@
         <w:rPr/>
       </w:pPr>
       <w:r>
+        <w:rPr/>
         <w:t>ORCID iDs: Cesar Amaral, https://orcid.org/0000-0002-4314-3517; Dafne Adriana Abreu dos Anjos, https://orcid.org/0000-0002-0769-2279; Anna Luisa dos Santos Donato, https://orcid.org/0000-0002-9286-8995; Leticia Bastos Eller, https://orcid.org/0000-0003-1524-5775; Rodrigo Goldenberg-Barbosa, https://orcid.org/0000-0002-4072-8608</w:t>
       </w:r>
     </w:p>
@@ -602,21 +634,7 @@
           <w:sz w:val="24"/>
           <w:szCs w:val="24"/>
         </w:rPr>
-        <w:t xml:space="preserve">In this work, we will determine the influence of heliospheric modulation and atmospheric pressure on dose rate in silicon (detector B) and in plastic (detector E). The dose rate is defined as the energy deposited by radiation per unit mass and time and is measured in Gy day-1 (J kg-1 day-1). During quiet times, the dose rate on the surface of Mars is—apart from a very small natural background—determined by the GCR and its interaction with the atmosphere and soil. It can be described by Equation </w:t>
-      </w:r>
-      <w:r>
-        <w:rPr>
-          <w:sz w:val="24"/>
-          <w:szCs w:val="24"/>
-        </w:rPr>
-        <w:t>1</w:t>
-      </w:r>
-      <w:r>
-        <w:rPr>
-          <w:sz w:val="24"/>
-          <w:szCs w:val="24"/>
-        </w:rPr>
-        <w:t>:</w:t>
+        <w:t>In this work, we will determine the influence of heliospheric modulation and atmospheric pressure on dose rate in silicon (detector B) and in plastic (detector E). The dose rate is defined as the energy deposited by radiation per unit mass and time and is measured in Gy day-1 (J kg-1 day-1). During quiet times, the dose rate on the surface of Mars is—apart from a very small natural background—determined by the GCR and its interaction with the atmosphere and soil. It can be described by Equation 1:</w:t>
       </w:r>
     </w:p>
     <w:p>
@@ -643,8 +661,9 @@
       <w:pPr>
         <w:pStyle w:val="Normal"/>
         <w:tabs>
-          <w:tab w:val="center" w:pos="4252"/>
-          <w:tab w:val="right" w:pos="8504"/>
+          <w:tab w:val="clear" w:pos="720"/>
+          <w:tab w:val="center" w:pos="4252" w:leader="none"/>
+          <w:tab w:val="right" w:pos="8504" w:leader="none"/>
         </w:tabs>
         <w:spacing w:lineRule="auto" w:line="480"/>
         <w:jc w:val="both"/>
@@ -656,11 +675,18 @@
         </w:rPr>
       </w:pPr>
       <w:r>
+        <w:rPr/>
         <w:tab/>
+      </w:r>
+      <w:r>
+        <w:rPr/>
       </w:r>
       <m:oMath xmlns:m="http://schemas.openxmlformats.org/officeDocument/2006/math">
         <m:r>
-          <m:t>D</m:t>
+          <w:rPr>
+            <w:rFonts w:ascii="Cambria Math" w:hAnsi="Cambria Math"/>
+          </w:rPr>
+          <m:t xml:space="preserve">D</m:t>
         </m:r>
         <m:d>
           <m:dPr>
@@ -669,22 +695,46 @@
           </m:dPr>
           <m:e>
             <m:r>
-              <m:t>Φ,P</m:t>
+              <w:rPr>
+                <w:rFonts w:ascii="Cambria Math" w:hAnsi="Cambria Math"/>
+              </w:rPr>
+              <m:t xml:space="preserve">Φ</m:t>
+            </m:r>
+            <m:r>
+              <w:rPr>
+                <w:rFonts w:ascii="Cambria Math" w:hAnsi="Cambria Math"/>
+              </w:rPr>
+              <m:t xml:space="preserve">,</m:t>
+            </m:r>
+            <m:r>
+              <w:rPr>
+                <w:rFonts w:ascii="Cambria Math" w:hAnsi="Cambria Math"/>
+              </w:rPr>
+              <m:t xml:space="preserve">P</m:t>
             </m:r>
           </m:e>
         </m:d>
         <m:r>
-          <m:t>=</m:t>
+          <m:rPr>
+            <m:lit/>
+            <m:nor/>
+          </m:rPr>
+          <w:rPr>
+            <w:rFonts w:ascii="Cambria Math" w:hAnsi="Cambria Math"/>
+          </w:rPr>
+          <m:t xml:space="preserve">=</m:t>
         </m:r>
         <m:nary>
           <m:naryPr>
             <m:chr m:val="∑"/>
-            <m:limLoc m:val="undOvr"/>
             <m:supHide m:val="1"/>
           </m:naryPr>
           <m:sub>
             <m:r>
-              <m:t>j</m:t>
+              <w:rPr>
+                <w:rFonts w:ascii="Cambria Math" w:hAnsi="Cambria Math"/>
+              </w:rPr>
+              <m:t xml:space="preserve">j</m:t>
             </m:r>
           </m:sub>
           <m:sup/>
@@ -692,15 +742,14 @@
             <m:nary>
               <m:naryPr>
                 <m:chr m:val="∑"/>
-                <m:limLoc m:val="undOvr"/>
                 <m:supHide m:val="1"/>
               </m:naryPr>
               <m:sub>
                 <m:r>
-                  <m:rPr>
-                    <m:sty m:val="p"/>
-                  </m:rPr>
-                  <m:t>area</m:t>
+                  <w:rPr>
+                    <w:rFonts w:ascii="Cambria Math" w:hAnsi="Cambria Math"/>
+                  </w:rPr>
+                  <m:t xml:space="preserve">area</m:t>
                 </m:r>
               </m:sub>
               <m:sup/>
@@ -708,56 +757,72 @@
                 <m:nary>
                   <m:naryPr>
                     <m:chr m:val="∫"/>
-                    <m:limLoc m:val="subSup"/>
                   </m:naryPr>
                   <m:sub>
                     <m:r>
-                      <m:t>ε</m:t>
+                      <w:rPr>
+                        <w:rFonts w:ascii="Cambria Math" w:hAnsi="Cambria Math"/>
+                      </w:rPr>
+                      <m:t xml:space="preserve">ε</m:t>
                     </m:r>
                     <m:r>
-                      <m:rPr>
-                        <m:sty m:val="p"/>
-                      </m:rPr>
-                      <m:t>min</m:t>
+                      <w:rPr>
+                        <w:rFonts w:ascii="Cambria Math" w:hAnsi="Cambria Math"/>
+                      </w:rPr>
+                      <m:t xml:space="preserve">min</m:t>
                     </m:r>
                   </m:sub>
                   <m:sup>
                     <m:r>
-                      <m:t>ε</m:t>
+                      <w:rPr>
+                        <w:rFonts w:ascii="Cambria Math" w:hAnsi="Cambria Math"/>
+                      </w:rPr>
+                      <m:t xml:space="preserve">ε</m:t>
                     </m:r>
                     <m:r>
-                      <m:rPr>
-                        <m:sty m:val="p"/>
-                      </m:rPr>
-                      <m:t>max</m:t>
+                      <w:rPr>
+                        <w:rFonts w:ascii="Cambria Math" w:hAnsi="Cambria Math"/>
+                      </w:rPr>
+                      <m:t xml:space="preserve">max</m:t>
                     </m:r>
                   </m:sup>
                   <m:e>
                     <m:nary>
                       <m:naryPr>
                         <m:chr m:val="∫"/>
-                        <m:limLoc m:val="subSup"/>
                       </m:naryPr>
                       <m:sub>
                         <m:r>
-                          <m:t>0</m:t>
+                          <w:rPr>
+                            <w:rFonts w:ascii="Cambria Math" w:hAnsi="Cambria Math"/>
+                          </w:rPr>
+                          <m:t xml:space="preserve">0</m:t>
                         </m:r>
                       </m:sub>
                       <m:sup>
                         <m:r>
-                          <m:t>∞</m:t>
+                          <w:rPr>
+                            <w:rFonts w:ascii="Cambria Math" w:hAnsi="Cambria Math"/>
+                          </w:rPr>
+                          <m:t xml:space="preserve">∞</m:t>
                         </m:r>
                       </m:sup>
                       <m:e>
                         <m:sSub>
                           <m:e>
                             <m:r>
-                              <m:t>λ</m:t>
+                              <w:rPr>
+                                <w:rFonts w:ascii="Cambria Math" w:hAnsi="Cambria Math"/>
+                              </w:rPr>
+                              <m:t xml:space="preserve">λ</m:t>
                             </m:r>
                           </m:e>
                           <m:sub>
                             <m:r>
-                              <m:t>j</m:t>
+                              <w:rPr>
+                                <w:rFonts w:ascii="Cambria Math" w:hAnsi="Cambria Math"/>
+                              </w:rPr>
+                              <m:t xml:space="preserve">j</m:t>
                             </m:r>
                           </m:sub>
                         </m:sSub>
@@ -768,19 +833,40 @@
                           </m:dPr>
                           <m:e>
                             <m:r>
-                              <m:t>E,ε</m:t>
+                              <w:rPr>
+                                <w:rFonts w:ascii="Cambria Math" w:hAnsi="Cambria Math"/>
+                              </w:rPr>
+                              <m:t xml:space="preserve">E</m:t>
+                            </m:r>
+                            <m:r>
+                              <w:rPr>
+                                <w:rFonts w:ascii="Cambria Math" w:hAnsi="Cambria Math"/>
+                              </w:rPr>
+                              <m:t xml:space="preserve">,</m:t>
+                            </m:r>
+                            <m:r>
+                              <w:rPr>
+                                <w:rFonts w:ascii="Cambria Math" w:hAnsi="Cambria Math"/>
+                              </w:rPr>
+                              <m:t xml:space="preserve">ε</m:t>
                             </m:r>
                           </m:e>
                         </m:d>
                         <m:sSub>
                           <m:e>
                             <m:r>
-                              <m:t>F</m:t>
+                              <w:rPr>
+                                <w:rFonts w:ascii="Cambria Math" w:hAnsi="Cambria Math"/>
+                              </w:rPr>
+                              <m:t xml:space="preserve">F</m:t>
                             </m:r>
                           </m:e>
                           <m:sub>
                             <m:r>
-                              <m:t>j</m:t>
+                              <w:rPr>
+                                <w:rFonts w:ascii="Cambria Math" w:hAnsi="Cambria Math"/>
+                              </w:rPr>
+                              <m:t xml:space="preserve">j</m:t>
                             </m:r>
                           </m:sub>
                         </m:sSub>
@@ -791,30 +877,76 @@
                           </m:dPr>
                           <m:e>
                             <m:r>
-                              <m:t>Φ,P,E</m:t>
+                              <w:rPr>
+                                <w:rFonts w:ascii="Cambria Math" w:hAnsi="Cambria Math"/>
+                              </w:rPr>
+                              <m:t xml:space="preserve">Φ</m:t>
+                            </m:r>
+                            <m:r>
+                              <w:rPr>
+                                <w:rFonts w:ascii="Cambria Math" w:hAnsi="Cambria Math"/>
+                              </w:rPr>
+                              <m:t xml:space="preserve">,</m:t>
+                            </m:r>
+                            <m:r>
+                              <w:rPr>
+                                <w:rFonts w:ascii="Cambria Math" w:hAnsi="Cambria Math"/>
+                              </w:rPr>
+                              <m:t xml:space="preserve">P</m:t>
+                            </m:r>
+                            <m:r>
+                              <w:rPr>
+                                <w:rFonts w:ascii="Cambria Math" w:hAnsi="Cambria Math"/>
+                              </w:rPr>
+                              <m:t xml:space="preserve">,</m:t>
+                            </m:r>
+                            <m:r>
+                              <w:rPr>
+                                <w:rFonts w:ascii="Cambria Math" w:hAnsi="Cambria Math"/>
+                              </w:rPr>
+                              <m:t xml:space="preserve">E</m:t>
                             </m:r>
                           </m:e>
                         </m:d>
                         <m:r>
-                          <m:rPr>
-                            <m:sty m:val="p"/>
-                          </m:rPr>
-                          <m:t>d</m:t>
+                          <w:rPr>
+                            <w:rFonts w:ascii="Cambria Math" w:hAnsi="Cambria Math"/>
+                          </w:rPr>
+                          <m:t xml:space="preserve">d</m:t>
                         </m:r>
                         <m:r>
-                          <m:t>E</m:t>
+                          <w:rPr>
+                            <w:rFonts w:ascii="Cambria Math" w:hAnsi="Cambria Math"/>
+                          </w:rPr>
+                          <m:t xml:space="preserve">E</m:t>
+                        </m:r>
+                        <m:r>
+                          <w:rPr>
+                            <w:rFonts w:ascii="Cambria Math" w:hAnsi="Cambria Math"/>
+                          </w:rPr>
+                          <m:t xml:space="preserve">d</m:t>
+                        </m:r>
+                        <m:r>
+                          <w:rPr>
+                            <w:rFonts w:ascii="Cambria Math" w:hAnsi="Cambria Math"/>
+                          </w:rPr>
+                          <m:t xml:space="preserve">ε</m:t>
                         </m:r>
                         <m:r>
                           <m:rPr>
-                            <m:sty m:val="p"/>
+                            <m:lit/>
+                            <m:nor/>
                           </m:rPr>
-                          <m:t>d</m:t>
+                          <w:rPr>
+                            <w:rFonts w:ascii="Cambria Math" w:hAnsi="Cambria Math"/>
+                          </w:rPr>
+                          <m:t xml:space="preserve">/</m:t>
                         </m:r>
                         <m:r>
-                          <m:t>ε</m:t>
-                        </m:r>
-                        <m:r>
-                          <m:t>/m</m:t>
+                          <w:rPr>
+                            <w:rFonts w:ascii="Cambria Math" w:hAnsi="Cambria Math"/>
+                          </w:rPr>
+                          <m:t xml:space="preserve">m</m:t>
                         </m:r>
                       </m:e>
                     </m:nary>
@@ -995,18 +1127,18 @@
       </w:pPr>
       <w:r>
         <w:rPr/>
-        <w:t>Periodicities in the dose-rate series were further characterized using a continuous wavelet transform (Morlet wavelet, Torrence &amp; Compo 1998, implemented in Python via pycwt), computed both for each ~90-SOL window (Figures 2-4) and for the full per-sol record (Figure 6), with the scale range set to resolve periods from a few sols up to several Martian years.</w:t>
-      </w:r>
-    </w:p>
-    <w:p>
-      <w:pPr>
-        <w:pStyle w:val="Normal"/>
-        <w:spacing w:lineRule="auto" w:line="480"/>
-        <w:rPr/>
-      </w:pPr>
-      <w:r>
-        <w:rPr/>
-        <w:t>Both the classical decomposition and the solar-activity regression below are sensitive to Solar Particle Events (SPEs): a single-sol dose excursion falls into one phase bin of the ~669-sol modulo average, and because the reconstructed seasonal component tiles that per-phase average across every cycle, a single real transient event can otherwise appear as a spurious periodic signal repeated at every ~669-sol interval. Sols departing by more than 8 median absolute deviations from a 21-sol rolling median were flagged and linearly interpolated over before decomposition or regression (left unaltered in the raw series shown in Figures 5 and 7, and in the wavelet transform, which correctly localizes each event as a short-period transient rather than an annual signal). This flagged 29-35 sols, clustered into roughly nine distinct events, consistent with the SPE-affected windows already noted in Table 1 (e.g. “2014 SPE”, “2017 SPE”) plus additional events during the rise of solar cycle 25 (2022-2024), the largest being SOL 04190 (≈2024-05-14), independently reported by NASA/JPL as the largest radiation surge RAD had recorded since landing.</w:t>
+        <w:t>Periodicities in the dose-rate series were further characterized using a continuous wavelet transform (Morlet wavelet, Torrence &amp; Compo 1998, implemented in Python via pycwt), computed both for each ~90-SOL window (Figures 1-3) and for the full per-sol record (Figure 5), with the scale range set to resolve periods from a few sols up to several Martian years.</w:t>
+      </w:r>
+    </w:p>
+    <w:p>
+      <w:pPr>
+        <w:pStyle w:val="Normal"/>
+        <w:spacing w:lineRule="auto" w:line="480"/>
+        <w:rPr/>
+      </w:pPr>
+      <w:r>
+        <w:rPr/>
+        <w:t>Both the classical decomposition and the solar-activity regression below are sensitive to Solar Particle Events (SPEs): a single-sol dose excursion falls into one phase bin of the ~669-sol modulo average, and because the reconstructed seasonal component tiles that per-phase average across every cycle, a single real transient event can otherwise appear as a spurious periodic signal repeated at every ~669-sol interval. Sols departing by more than 8 median absolute deviations from a 21-sol rolling median were flagged and linearly interpolated over before decomposition or regression (left unaltered in the raw series shown in Figures 4 and 6, and in the wavelet transform, which correctly localizes each event as a short-period transient rather than an annual signal). This flagged 29-35 sols, clustered into roughly nine distinct events, consistent with the SPE-affected windows already noted in Table 1 (e.g. “2014 SPE”, “2017 SPE”) plus additional events during the rise of solar cycle 25 (2022-2024), the largest being SOL 04190 (≈2024-05-14), independently reported by NASA/JPL as the largest radiation surge RAD had recorded since landing.</w:t>
       </w:r>
     </w:p>
     <w:p>
@@ -1131,7 +1263,7 @@
           <w:sz w:val="24"/>
           <w:szCs w:val="24"/>
         </w:rPr>
-        <w:t>The total dose rate (measured by detector E) decreases as atmospheric pressure increases (Figure 1). This decrease is attributed to the increased shielding provided by the atmosphere as pressure rises. Conversely, the count rate for neutral particles increases with increasing pressure. This is a result of the production of secondary neutrals at altitudes above the Pfotzer maximum (Bazilevskaya &amp; Svirzhevskaya, 1998). This behavior contrasts with neutron monitors on Earth's surface, which are located below the Pfotzer maximum and record a lower neutron count rate when atmospheric pressure increases (Roesler et al., 1998).</w:t>
+        <w:t>The total dose rate (measured by detector E) decreases as atmospheric pressure increases. This decrease is attributed to the increased shielding provided by the atmosphere as pressure rises. Conversely, the count rate for neutral particles increases with increasing pressure. This is a result of the production of secondary neutrals at altitudes above the Pfotzer maximum (Bazilevskaya &amp; Svirzhevskaya, 1998). This behavior contrasts with neutron monitors on Earth's surface, which are located below the Pfotzer maximum and record a lower neutron count rate when atmospheric pressure increases (Roesler et al., 1998).</w:t>
       </w:r>
     </w:p>
     <w:p>
@@ -1189,7 +1321,7 @@
       </w:pPr>
       <w:r>
         <w:rPr/>
-        <w:t>For each of these ~90-sol windows, a continuous wavelet transform of the detector-E dose-rate time series was also computed (Section 2.3), shown in Figure 2 (SOL 00000-00804), Figure 3 (SOL 00805-01772), and Figure 4 (SOL 01773-02358). No window shows a stable, narrowband periodicity at the ~669-sol Martian-year timescale, consistent with the absence of a resolved seasonal cycle established directly in Section 3.3. The one notable feature is transient rather than periodic: panel A of Figure 4 (SOL 01773-01869) captures the September 2017 solar energetic particle event as a short-lived, broadband power excursion rather than a recurring seasonal signal.</w:t>
+        <w:t>For each of these ~90-sol windows, a continuous wavelet transform of the detector-E dose-rate time series was also computed (Section 2.3), shown in Figure 1 (SOL 00000-00804), Figure 2 (SOL 00805-01772), and Figure 3 (SOL 01773-02358). No window shows a stable, narrowband periodicity at the ~669-sol Martian-year timescale, consistent with the absence of a resolved seasonal cycle established directly in Section 3.3. The one notable feature is transient rather than periodic: panel A of Figure 3 (SOL 01773-01869) captures the September 2017 solar energetic particle event as a short-lived, broadband power excursion rather than a recurring seasonal signal.</w:t>
       </w:r>
     </w:p>
     <w:p>
@@ -1342,7 +1474,7 @@
       </w:pPr>
       <w:r>
         <w:rPr/>
-        <w:t>The results agree: the long-term rise and fall in dose rate (Figure 5, trend panel) tracks the declining phase of solar cycle 24 followed by the rise of solar cycle 25 (quantified directly in Section 3.4), but neither the wavelet transform nor the classical decomposition's seasonal component (Figure 5; its shape remains low-amplitude and irregular across the 7.24-Martian-year record, not a smooth annual curve) provides independent evidence of a genuine Martian seasonal cycle. The dose-rate variation is accordingly attributed to solar-cycle modulation (heliospheric GCR modulation) rather than to a resolved seasonal periodicity. This is consistent with Guo et al. (2015), who noted -- without a dedicated spectral test -- that “the seasonal pressure influence is much smaller than the longer-term effects driven by solar modulation”; the wavelet and decomposition analyses here provide a direct, model-independent confirmation of that expectation, reinforced by the positive-control regression against real REMS pressure in Section 3.4. It is also consistent with the larger version of the same solar-cycle trend reported by Guo et al. (2021) and Ehresmann et al. (2023) through the deep solar minimum of 2019-2020 (~50% dose-rate increase from solar maximum), extended here through the subsequent rise of solar cycle 25.</w:t>
+        <w:t>The results agree: the long-term rise and fall in dose rate (Figure 4, trend panel) tracks the declining phase of solar cycle 24 followed by the rise of solar cycle 25 (quantified directly in Section 3.4), but neither the wavelet transform nor the classical decomposition's seasonal component (Figure 4; its shape remains low-amplitude and irregular across the 7.24-Martian-year record, not a smooth annual curve) provides independent evidence of a genuine Martian seasonal cycle. The dose-rate variation is accordingly attributed to solar-cycle modulation (heliospheric GCR modulation) rather than to a resolved seasonal periodicity. This is consistent with Guo et al. (2015), who noted -- without a dedicated spectral test -- that “the seasonal pressure influence is much smaller than the longer-term effects driven by solar modulation”; the wavelet and decomposition analyses here provide a direct, model-independent confirmation of that expectation, reinforced by the positive-control regression against real REMS pressure in Section 3.4. It is also consistent with the larger version of the same solar-cycle trend reported by Guo et al. (2021) and Ehresmann et al. (2023) through the deep solar minimum of 2019-2020 (~50% dose-rate increase from solar maximum), extended here through the subsequent rise of solar cycle 25.</w:t>
       </w:r>
     </w:p>
     <w:p>
@@ -1446,7 +1578,7 @@
       </w:pPr>
       <w:r>
         <w:rPr/>
-        <w:t>The regression residual was then tested for a seasonal component using the same classical decomposition as Section 3.3, and compared against the identical decomposition applied to real REMS atmospheric pressure over the same sols, as a positive control: pressure has a well-documented real seasonal cycle driven by polar CO2 condensation and sublimation (Section 2.2; Harri et al., 2014), so recovering it independently confirms the method's sensitivity to genuine periodic signals. Pressure's seasonal/residual ratio (9.69) is 26-31 times larger than the dose-rate residual's (0.375, detector B; 0.317, detector E; Table 3) -- the same method, on the same time axis, clearly detects a real seasonal signal in pressure and does not detect one in the dose-rate residual. Cross-correlating the dose-rate residual directly against REMS pressure across lags of -400 to +400 sols gives a maximum |r| of only 0.089 (B) and 0.146 (E), at lags with no physically meaningful interpretation (Figure 7, bottom panel).</w:t>
+        <w:t>The regression residual was then tested for a seasonal component using the same classical decomposition as Section 3.3, and compared against the identical decomposition applied to real REMS atmospheric pressure over the same sols, as a positive control: pressure has a well-documented real seasonal cycle driven by polar CO2 condensation and sublimation (Section 2.2; Harri et al., 2014), so recovering it independently confirms the method's sensitivity to genuine periodic signals. Pressure's seasonal/residual ratio (9.69) is 26-31 times larger than the dose-rate residual's (0.375, detector B; 0.317, detector E; Table 3) -- the same method, on the same time axis, clearly detects a real seasonal signal in pressure and does not detect one in the dose-rate residual. Cross-correlating the dose-rate residual directly against REMS pressure across lags of -400 to +400 sols gives a maximum |r| of only 0.089 (B) and 0.146 (E), at lags with no physically meaningful interpretation (Figure 6, bottom panel).</w:t>
       </w:r>
     </w:p>
     <w:p>
@@ -1560,28 +1692,28 @@
       </w:pPr>
       <w:r>
         <w:rPr/>
-        <w:t>Scanning for a lag between the (lightly smoothed) neutron monitor count rate and dose rate finds a best-fit lag of only +5 sols (detector B) and +10 sols (detector E) -- indistinguishable, at this record's time resolution, from an instantaneous response (Figure 8, left panel). This is itself informative: unlike some Earth-based studies that find galactic cosmic ray modulation lagging solar-wind and interplanetary-field changes by weeks to months at 1 AU, the Mars-surface dose rate tracks the Oulu count rate (1 AU, Earth) with no detectable differential delay at the ~1.5 AU distance to Mars, at least at this smoothing scale.</w:t>
-      </w:r>
-    </w:p>
-    <w:p>
-      <w:pPr>
-        <w:pStyle w:val="Normal"/>
-        <w:spacing w:lineRule="auto" w:line="480"/>
-        <w:rPr/>
-      </w:pPr>
-      <w:r>
-        <w:rPr/>
-      </w:r>
-    </w:p>
-    <w:p>
-      <w:pPr>
-        <w:pStyle w:val="Normal"/>
-        <w:spacing w:lineRule="auto" w:line="480"/>
-        <w:rPr/>
-      </w:pPr>
-      <w:r>
-        <w:rPr/>
-        <w:t>Because the record spans a complete solar-cycle reversal -- the declining phase of cycle 24 through the 2019-2020 minimum into the rising phase of cycle 25 -- it is possible, for the first time in the published MSL/RAD literature, to test whether the dose-rate response to a given level of GCR modulation is the same during the declining and rising phases. It is not: fitting the two phases separately (split at the trend's turning point, SOL ~2600) gives a significantly steeper slope during the rising phase of cycle 25 (0.372 and 0.500 uGy/hour per count-rate percentage point, detectors B and E) than during the declining phase of cycle 24 (0.306 and 0.435; Figure 8, right panel; Table 4). A formal interaction test confirms this difference is not due to chance (HAC p = 3.9×10⁻⁷ and 1.7×10⁻³, respectively): Mars-surface dose responds about 20% more strongly per unit of GCR proxy on the way up from solar minimum than it did on the way down from solar maximum -- a hysteresis loop in the dose-rate/GCR-modulation relationship that no prior published RAD analysis, restricted to the monotonic decline into the 2019-2020 minimum, could have detected.</w:t>
+        <w:t>Scanning for a lag between the (lightly smoothed) neutron monitor count rate and dose rate finds a best-fit lag of only +5 sols (detector B) and +10 sols (detector E) -- indistinguishable, at this record's time resolution, from an instantaneous response (Figure 7, left panel). This is itself informative: unlike some Earth-based studies that find galactic cosmic ray modulation lagging solar-wind and interplanetary-field changes by weeks to months at 1 AU, the Mars-surface dose rate tracks the Oulu count rate (1 AU, Earth) with no detectable differential delay at the ~1.5 AU distance to Mars, at least at this smoothing scale.</w:t>
+      </w:r>
+    </w:p>
+    <w:p>
+      <w:pPr>
+        <w:pStyle w:val="Normal"/>
+        <w:spacing w:lineRule="auto" w:line="480"/>
+        <w:rPr/>
+      </w:pPr>
+      <w:r>
+        <w:rPr/>
+      </w:r>
+    </w:p>
+    <w:p>
+      <w:pPr>
+        <w:pStyle w:val="Normal"/>
+        <w:spacing w:lineRule="auto" w:line="480"/>
+        <w:rPr/>
+      </w:pPr>
+      <w:r>
+        <w:rPr/>
+        <w:t>Because the record spans a complete solar-cycle reversal -- the declining phase of cycle 24 through the 2019-2020 minimum into the rising phase of cycle 25 -- it is possible, for the first time in the published MSL/RAD literature, to test whether the dose-rate response to a given level of GCR modulation is the same during the declining and rising phases. It is not: fitting the two phases separately (split at the trend's turning point, SOL ~2600) gives a significantly steeper slope during the rising phase of cycle 25 (0.372 and 0.500 uGy/hour per count-rate percentage point, detectors B and E) than during the declining phase of cycle 24 (0.306 and 0.435; Figure 7, right panel; Table 4). A formal interaction test confirms this difference is not due to chance (HAC p = 3.9×10⁻⁷ and 1.7×10⁻³, respectively): Mars-surface dose responds about 20% more strongly per unit of GCR proxy on the way up from solar minimum than it did on the way down from solar maximum -- a hysteresis loop in the dose-rate/GCR-modulation relationship that no prior published RAD analysis, restricted to the monotonic decline into the 2019-2020 minimum, could have detected.</w:t>
       </w:r>
     </w:p>
     <w:p>
@@ -1643,7 +1775,7 @@
       </w:pPr>
       <w:r>
         <w:rPr/>
-        <w:t>As a third test for a seasonal periodicity, independent of the phase-binning assumption underlying the classical decomposition and free of the time-localization tradeoffs of the wavelet transform, a Lomb-Scargle periodogram (Section 2.3) was computed on the residual of the neutron-monitor regression (Section 3.5). Power at the single, externally motivated annual frequency (1/668.6 sols) is indistinguishable from the noise floor for both detectors (power = 0.009 and 0.004, single-frequency false-alarm probability = 0.99 and 1.00 for detectors B and E, respectively; Figure 9) -- a third, methodologically independent confirmation that no annual periodicity is present. The only feature exceeding the scan-corrected significance threshold anywhere in the periodogram is a rise in power toward the longest periods scanned (~1,500 sols; Figure 9), consistent with residual curvature in the secular trend that a single linear regression term cannot fully capture, not a periodic signal.</w:t>
+        <w:t>As a third test for a seasonal periodicity, independent of the phase-binning assumption underlying the classical decomposition and free of the time-localization tradeoffs of the wavelet transform, a Lomb-Scargle periodogram (Section 2.3) was computed on the residual of the neutron-monitor regression (Section 3.5). Power at the single, externally motivated annual frequency (1/668.6 sols) is indistinguishable from the noise floor for both detectors (power = 0.009 and 0.004, single-frequency false-alarm probability = 0.99 and 1.00 for detectors B and E, respectively; Figure 8) -- a third, methodologically independent confirmation that no annual periodicity is present. The only feature exceeding the scan-corrected significance threshold anywhere in the periodogram is a rise in power toward the longest periods scanned (~1,500 sols; Figure 8), consistent with residual curvature in the secular trend that a single linear regression term cannot fully capture, not a periodic signal.</w:t>
       </w:r>
     </w:p>
     <w:p>
@@ -8630,6 +8762,16 @@
       <w:pPr>
         <w:pStyle w:val="Normal"/>
         <w:spacing w:lineRule="auto" w:line="480"/>
+        <w:rPr/>
+      </w:pPr>
+      <w:r>
+        <w:rPr/>
+      </w:r>
+    </w:p>
+    <w:p>
+      <w:pPr>
+        <w:pStyle w:val="Normal"/>
+        <w:spacing w:lineRule="auto" w:line="480"/>
         <w:jc w:val="both"/>
         <w:rPr>
           <w:rFonts w:ascii="Calibri" w:hAnsi="Calibri"/>
@@ -8641,9 +8783,9 @@
         <w:rPr/>
         <w:drawing>
           <wp:inline distT="0" distB="0" distL="0" distR="0">
-            <wp:extent cx="3762375" cy="6362700"/>
+            <wp:extent cx="5400040" cy="6518910"/>
             <wp:effectExtent l="0" t="0" r="0" b="0"/>
-            <wp:docPr id="2" name="image2.png"/>
+            <wp:docPr id="2" name="image5.png"/>
             <wp:cNvGraphicFramePr>
               <a:graphicFrameLocks xmlns:a="http://schemas.openxmlformats.org/drawingml/2006/main" noChangeAspect="1"/>
             </wp:cNvGraphicFramePr>
@@ -8651,7 +8793,7 @@
               <a:graphicData uri="http://schemas.openxmlformats.org/drawingml/2006/picture">
                 <pic:pic xmlns:pic="http://schemas.openxmlformats.org/drawingml/2006/picture">
                   <pic:nvPicPr>
-                    <pic:cNvPr id="2" name="image2.png"/>
+                    <pic:cNvPr id="2" name="image5.png"/>
                     <pic:cNvPicPr>
                       <a:picLocks noChangeAspect="1" noChangeArrowheads="1"/>
                     </pic:cNvPicPr>
@@ -8665,7 +8807,7 @@
                   <pic:spPr bwMode="auto">
                     <a:xfrm>
                       <a:off x="0" y="0"/>
-                      <a:ext cx="3762375" cy="6362700"/>
+                      <a:ext cx="5400040" cy="6518910"/>
                     </a:xfrm>
                     <a:prstGeom prst="rect">
                       <a:avLst/>
@@ -8696,7 +8838,7 @@
           <w:sz w:val="24"/>
           <w:szCs w:val="24"/>
         </w:rPr>
-        <w:t>Figure 1. Hourly perturbations from the daily average of (a) total E-detector dose, (b) E-detector neutral count rate, and (c) atmospheric pressure, illustrating the diurnal anti-correlation between dose rate and pressure discussed in Section 3.1. Reproduced from the pattern reported by Rafkin et al. (2014).</w:t>
+        <w:t>Figure 1. Wavelet power spectrum of the E-detector dose-rate time series for SOL windows 00000-00089 through 00708-00804 (panels A-H), computed as described in Section 2.3.</w:t>
       </w:r>
     </w:p>
     <w:p>
@@ -8726,7 +8868,7 @@
           <wp:inline distT="0" distB="0" distL="0" distR="0">
             <wp:extent cx="5400040" cy="6518910"/>
             <wp:effectExtent l="0" t="0" r="0" b="0"/>
-            <wp:docPr id="3" name="image5.png"/>
+            <wp:docPr id="3" name="image3.png"/>
             <wp:cNvGraphicFramePr>
               <a:graphicFrameLocks xmlns:a="http://schemas.openxmlformats.org/drawingml/2006/main" noChangeAspect="1"/>
             </wp:cNvGraphicFramePr>
@@ -8734,7 +8876,7 @@
               <a:graphicData uri="http://schemas.openxmlformats.org/drawingml/2006/picture">
                 <pic:pic xmlns:pic="http://schemas.openxmlformats.org/drawingml/2006/picture">
                   <pic:nvPicPr>
-                    <pic:cNvPr id="3" name="image5.png"/>
+                    <pic:cNvPr id="3" name="image3.png"/>
                     <pic:cNvPicPr>
                       <a:picLocks noChangeAspect="1" noChangeArrowheads="1"/>
                     </pic:cNvPicPr>
@@ -8779,7 +8921,7 @@
           <w:sz w:val="24"/>
           <w:szCs w:val="24"/>
         </w:rPr>
-        <w:t>Figure 2. Wavelet power spectrum of the E-detector dose-rate time series for SOL windows 00000-00089 through 00708-00804 (panels A-H), computed as described in Section 2.3.</w:t>
+        <w:t>Figure 2. Wavelet power spectrum of the E-detector dose-rate time series for SOL windows 00805-00938 through 01649-01772 (panels A-H).</w:t>
       </w:r>
     </w:p>
     <w:p>
@@ -8807,9 +8949,9 @@
         <w:rPr/>
         <w:drawing>
           <wp:inline distT="0" distB="0" distL="0" distR="0">
-            <wp:extent cx="5400040" cy="6518910"/>
+            <wp:extent cx="5400040" cy="4874895"/>
             <wp:effectExtent l="0" t="0" r="0" b="0"/>
-            <wp:docPr id="4" name="image3.png"/>
+            <wp:docPr id="4" name="image6.png"/>
             <wp:cNvGraphicFramePr>
               <a:graphicFrameLocks xmlns:a="http://schemas.openxmlformats.org/drawingml/2006/main" noChangeAspect="1"/>
             </wp:cNvGraphicFramePr>
@@ -8817,96 +8959,13 @@
               <a:graphicData uri="http://schemas.openxmlformats.org/drawingml/2006/picture">
                 <pic:pic xmlns:pic="http://schemas.openxmlformats.org/drawingml/2006/picture">
                   <pic:nvPicPr>
-                    <pic:cNvPr id="4" name="image3.png"/>
+                    <pic:cNvPr id="4" name="image6.png"/>
                     <pic:cNvPicPr>
                       <a:picLocks noChangeAspect="1" noChangeArrowheads="1"/>
                     </pic:cNvPicPr>
                   </pic:nvPicPr>
                   <pic:blipFill>
                     <a:blip r:embed="rId5"/>
-                    <a:stretch>
-                      <a:fillRect/>
-                    </a:stretch>
-                  </pic:blipFill>
-                  <pic:spPr bwMode="auto">
-                    <a:xfrm>
-                      <a:off x="0" y="0"/>
-                      <a:ext cx="5400040" cy="6518910"/>
-                    </a:xfrm>
-                    <a:prstGeom prst="rect">
-                      <a:avLst/>
-                    </a:prstGeom>
-                    <a:noFill/>
-                  </pic:spPr>
-                </pic:pic>
-              </a:graphicData>
-            </a:graphic>
-          </wp:inline>
-        </w:drawing>
-      </w:r>
-    </w:p>
-    <w:p>
-      <w:pPr>
-        <w:pStyle w:val="Normal"/>
-        <w:spacing w:lineRule="auto" w:line="480"/>
-        <w:jc w:val="both"/>
-        <w:rPr>
-          <w:rFonts w:ascii="Calibri" w:hAnsi="Calibri"/>
-          <w:sz w:val="24"/>
-          <w:szCs w:val="24"/>
-        </w:rPr>
-      </w:pPr>
-      <w:r>
-        <w:rPr>
-          <w:i/>
-          <w:sz w:val="24"/>
-          <w:szCs w:val="24"/>
-        </w:rPr>
-        <w:t>Figure 3. Wavelet power spectrum of the E-detector dose-rate time series for SOL windows 00805-00938 through 01649-01772 (panels A-H).</w:t>
-      </w:r>
-    </w:p>
-    <w:p>
-      <w:pPr>
-        <w:pStyle w:val="Normal"/>
-        <w:spacing w:lineRule="auto" w:line="480"/>
-        <w:rPr/>
-      </w:pPr>
-      <w:r>
-        <w:rPr/>
-      </w:r>
-    </w:p>
-    <w:p>
-      <w:pPr>
-        <w:pStyle w:val="Normal"/>
-        <w:spacing w:lineRule="auto" w:line="480"/>
-        <w:jc w:val="both"/>
-        <w:rPr>
-          <w:rFonts w:ascii="Calibri" w:hAnsi="Calibri"/>
-          <w:sz w:val="24"/>
-          <w:szCs w:val="24"/>
-        </w:rPr>
-      </w:pPr>
-      <w:r>
-        <w:rPr/>
-        <w:drawing>
-          <wp:inline distT="0" distB="0" distL="0" distR="0">
-            <wp:extent cx="5400040" cy="4874895"/>
-            <wp:effectExtent l="0" t="0" r="0" b="0"/>
-            <wp:docPr id="5" name="image6.png"/>
-            <wp:cNvGraphicFramePr>
-              <a:graphicFrameLocks xmlns:a="http://schemas.openxmlformats.org/drawingml/2006/main" noChangeAspect="1"/>
-            </wp:cNvGraphicFramePr>
-            <a:graphic xmlns:a="http://schemas.openxmlformats.org/drawingml/2006/main">
-              <a:graphicData uri="http://schemas.openxmlformats.org/drawingml/2006/picture">
-                <pic:pic xmlns:pic="http://schemas.openxmlformats.org/drawingml/2006/picture">
-                  <pic:nvPicPr>
-                    <pic:cNvPr id="5" name="image6.png"/>
-                    <pic:cNvPicPr>
-                      <a:picLocks noChangeAspect="1" noChangeArrowheads="1"/>
-                    </pic:cNvPicPr>
-                  </pic:nvPicPr>
-                  <pic:blipFill>
-                    <a:blip r:embed="rId6"/>
                     <a:stretch>
                       <a:fillRect/>
                     </a:stretch>
@@ -8945,7 +9004,7 @@
           <w:sz w:val="24"/>
           <w:szCs w:val="24"/>
         </w:rPr>
-        <w:t>Figure 4. Wavelet power spectrum of the E-detector dose-rate time series for SOL windows 01773-01869 through 02225-02358 (panels A-E). Panel A (SOL 01773-01869) captures the September 2017 solar energetic particle event.</w:t>
+        <w:t>Figure 3. Wavelet power spectrum of the E-detector dose-rate time series for SOL windows 01773-01869 through 02225-02358 (panels A-E). Panel A (SOL 01773-01869) captures the September 2017 solar energetic particle event.</w:t>
       </w:r>
     </w:p>
     <w:p>
@@ -8974,7 +9033,7 @@
           <wp:inline distT="0" distB="0" distL="0" distR="0">
             <wp:extent cx="5669280" cy="3916045"/>
             <wp:effectExtent l="0" t="0" r="0" b="0"/>
-            <wp:docPr id="6" name="Picture 9"/>
+            <wp:docPr id="5" name="Picture 9"/>
             <wp:cNvGraphicFramePr>
               <a:graphicFrameLocks xmlns:a="http://schemas.openxmlformats.org/drawingml/2006/main" noChangeAspect="1"/>
             </wp:cNvGraphicFramePr>
@@ -8982,13 +9041,13 @@
               <a:graphicData uri="http://schemas.openxmlformats.org/drawingml/2006/picture">
                 <pic:pic xmlns:pic="http://schemas.openxmlformats.org/drawingml/2006/picture">
                   <pic:nvPicPr>
-                    <pic:cNvPr id="6" name="Picture 9"/>
+                    <pic:cNvPr id="5" name="Picture 9"/>
                     <pic:cNvPicPr>
                       <a:picLocks noChangeAspect="1" noChangeArrowheads="1"/>
                     </pic:cNvPicPr>
                   </pic:nvPicPr>
                   <pic:blipFill>
-                    <a:blip r:embed="rId7"/>
+                    <a:blip r:embed="rId6"/>
                     <a:stretch>
                       <a:fillRect/>
                     </a:stretch>
@@ -9026,7 +9085,7 @@
           <w:sz w:val="24"/>
           <w:szCs w:val="24"/>
         </w:rPr>
-        <w:t>Figure 5. Classical additive decomposition (trend + seasonal + residual) of the combined 13.5-year (SOL 00001-04843, 7.24 Martian years) detector-E dose-rate series, using a period of 669 sols (one Martian year; Section 2.3), computed on a real per-sol time axis. The trend component rises and falls smoothly, tracking the declining phase of solar cycle 24 (~SOL 0-2600) and the rise of solar cycle 25 (~SOL 2600-4843; Section 3.4). Sols affected by Solar Particle Events (SPEs; Section 2.3) were excluded from the decomposition to prevent single transient events from appearing as spurious repeated “seasonal” spikes; the raw series above (Observed panel) is unaltered and includes the well-documented May 2024 SPE (SOL 04190). The fitted seasonal component remains low-amplitude and irregular, not resembling a smooth annual cycle.</w:t>
+        <w:t>Figure 4. Classical additive decomposition (trend + seasonal + residual) of the combined 13.5-year (SOL 00001-04843, 7.24 Martian years) detector-E dose-rate series, using a period of 669 sols (one Martian year; Section 2.3), computed on a real per-sol time axis. The trend component rises and falls smoothly, tracking the declining phase of solar cycle 24 (~SOL 0-2600) and the rise of solar cycle 25 (~SOL 2600-4843; Section 3.4). Sols affected by Solar Particle Events (SPEs; Section 2.3) were excluded from the decomposition to prevent single transient events from appearing as spurious repeated “seasonal” spikes; the raw series above (Observed panel) is unaltered and includes the well-documented May 2024 SPE (SOL 04190). The fitted seasonal component remains low-amplitude and irregular, not resembling a smooth annual cycle.</w:t>
       </w:r>
     </w:p>
     <w:p>
@@ -9055,7 +9114,7 @@
           <wp:inline distT="0" distB="0" distL="0" distR="0">
             <wp:extent cx="5669280" cy="2591435"/>
             <wp:effectExtent l="0" t="0" r="0" b="0"/>
-            <wp:docPr id="7" name="Picture 10"/>
+            <wp:docPr id="6" name="Picture 10"/>
             <wp:cNvGraphicFramePr>
               <a:graphicFrameLocks xmlns:a="http://schemas.openxmlformats.org/drawingml/2006/main" noChangeAspect="1"/>
             </wp:cNvGraphicFramePr>
@@ -9063,13 +9122,13 @@
               <a:graphicData uri="http://schemas.openxmlformats.org/drawingml/2006/picture">
                 <pic:pic xmlns:pic="http://schemas.openxmlformats.org/drawingml/2006/picture">
                   <pic:nvPicPr>
-                    <pic:cNvPr id="7" name="Picture 10"/>
+                    <pic:cNvPr id="6" name="Picture 10"/>
                     <pic:cNvPicPr>
                       <a:picLocks noChangeAspect="1" noChangeArrowheads="1"/>
                     </pic:cNvPicPr>
                   </pic:nvPicPr>
                   <pic:blipFill>
-                    <a:blip r:embed="rId8"/>
+                    <a:blip r:embed="rId7"/>
                     <a:stretch>
                       <a:fillRect/>
                     </a:stretch>
@@ -9107,7 +9166,7 @@
           <w:sz w:val="24"/>
           <w:szCs w:val="24"/>
         </w:rPr>
-        <w:t>Figure 6. Wavelet power spectrum (Morlet, Torrence &amp; Compo 1998) of the combined 13.5-year (SOL 00001-04843, 7.24 Martian years) detector-E series, computed on a real per-sol time axis. Elevated power near the 1-Martian-year line (red dashed) follows the classic cone-of-influence “dome” produced by a strong secular trend, not a sustained periodic band; the pattern is essentially identical in detector B (not shown). Short isolated high-power features below the annual band (e.g. near SOL 1800, 3300, and the tallest near SOL 4190) correspond to individual Solar Particle Events, correctly localized in time and to short periods (~10-30 sols) rather than being smeared into the annual band. No independent evidence of a clean annual/seasonal periodicity is found.</w:t>
+        <w:t>Figure 5. Wavelet power spectrum (Morlet, Torrence &amp; Compo 1998) of the combined 13.5-year (SOL 00001-04843, 7.24 Martian years) detector-E series, computed on a real per-sol time axis. Elevated power near the 1-Martian-year line (red dashed) follows the classic cone-of-influence “dome” produced by a strong secular trend, not a sustained periodic band; the pattern is essentially identical in detector B (not shown). Short isolated high-power features below the annual band (e.g. near SOL 1800, 3300, and the tallest near SOL 4190) correspond to individual Solar Particle Events, correctly localized in time and to short periods (~10-30 sols) rather than being smeared into the annual band. No independent evidence of a clean annual/seasonal periodicity is found.</w:t>
       </w:r>
     </w:p>
     <w:p>
@@ -9132,7 +9191,7 @@
           <wp:inline distT="0" distB="0" distL="0" distR="0">
             <wp:extent cx="5669280" cy="3446145"/>
             <wp:effectExtent l="0" t="0" r="0" b="0"/>
-            <wp:docPr id="8" name="Picture 11"/>
+            <wp:docPr id="7" name="Picture 11"/>
             <wp:cNvGraphicFramePr>
               <a:graphicFrameLocks xmlns:a="http://schemas.openxmlformats.org/drawingml/2006/main" noChangeAspect="1"/>
             </wp:cNvGraphicFramePr>
@@ -9140,13 +9199,13 @@
               <a:graphicData uri="http://schemas.openxmlformats.org/drawingml/2006/picture">
                 <pic:pic xmlns:pic="http://schemas.openxmlformats.org/drawingml/2006/picture">
                   <pic:nvPicPr>
-                    <pic:cNvPr id="8" name="Picture 11"/>
+                    <pic:cNvPr id="7" name="Picture 11"/>
                     <pic:cNvPicPr>
                       <a:picLocks noChangeAspect="1" noChangeArrowheads="1"/>
                     </pic:cNvPicPr>
                   </pic:nvPicPr>
                   <pic:blipFill>
-                    <a:blip r:embed="rId9"/>
+                    <a:blip r:embed="rId8"/>
                     <a:stretch>
                       <a:fillRect/>
                     </a:stretch>
@@ -9176,7 +9235,7 @@
       </w:pPr>
       <w:r>
         <w:rPr/>
-        <w:t>Figure 7. Detector E dose rate regressed against smoothed solar activity and tested for a residual seasonal signal against real REMS pressure (Section 2.3, 3.4). Top: observed dose rate (navy) and the OLS fit against the 13-month-smoothed observed sunspot number (red; R² = 0.85, excluding the SOL 04190 SPE, annotated). Middle: the regression residual (gray, left axis) against real REMS-measured atmospheric pressure (teal, right axis) over the same sols -- pressure's well-documented real seasonal cycle is visually obvious; the dose-rate residual shows no comparable structure. Bottom: cross-correlation between the residual and REMS pressure across lags of -400 to +400 sols, remaining weak (|r| &lt; 0.15) throughout, with no physically meaningful peak near zero lag or at the annual period.</w:t>
+        <w:t>Figure 6. Detector E dose rate regressed against smoothed solar activity and tested for a residual seasonal signal against real REMS pressure (Section 2.3, 3.4). Top: observed dose rate (navy) and the OLS fit against the 13-month-smoothed observed sunspot number (red; R² = 0.85, excluding the SOL 04190 SPE, annotated). Middle: the regression residual (gray, left axis) against real REMS-measured atmospheric pressure (teal, right axis) over the same sols -- pressure's well-documented real seasonal cycle is visually obvious; the dose-rate residual shows no comparable structure. Bottom: cross-correlation between the residual and REMS pressure across lags of -400 to +400 sols, remaining weak (|r| &lt; 0.15) throughout, with no physically meaningful peak near zero lag or at the annual period.</w:t>
       </w:r>
     </w:p>
     <w:p>
@@ -9201,7 +9260,7 @@
           <wp:inline distT="0" distB="0" distL="0" distR="0">
             <wp:extent cx="5669280" cy="2176145"/>
             <wp:effectExtent l="0" t="0" r="0" b="0"/>
-            <wp:docPr id="9" name="Picture 12"/>
+            <wp:docPr id="8" name="Picture 12"/>
             <wp:cNvGraphicFramePr>
               <a:graphicFrameLocks xmlns:a="http://schemas.openxmlformats.org/drawingml/2006/main" noChangeAspect="1"/>
             </wp:cNvGraphicFramePr>
@@ -9209,13 +9268,13 @@
               <a:graphicData uri="http://schemas.openxmlformats.org/drawingml/2006/picture">
                 <pic:pic xmlns:pic="http://schemas.openxmlformats.org/drawingml/2006/picture">
                   <pic:nvPicPr>
-                    <pic:cNvPr id="9" name="Picture 12"/>
+                    <pic:cNvPr id="8" name="Picture 12"/>
                     <pic:cNvPicPr>
                       <a:picLocks noChangeAspect="1" noChangeArrowheads="1"/>
                     </pic:cNvPicPr>
                   </pic:nvPicPr>
                   <pic:blipFill>
-                    <a:blip r:embed="rId10"/>
+                    <a:blip r:embed="rId9"/>
                     <a:stretch>
                       <a:fillRect/>
                     </a:stretch>
@@ -9245,7 +9304,7 @@
       </w:pPr>
       <w:r>
         <w:rPr/>
-        <w:t>Figure 8. Left: R² of the dose-rate regression against the Oulu neutron monitor count rate (27-sol smoothed) as a function of lag, detector E; the peak (best fit) sits within 10 sols of zero, indistinguishable from an instantaneous response. Right: hysteresis loop -- dose rate (detector E) plotted against the neutron monitor count rate (387-sol smoothed, at the best-fit lag), colored by SOL; separate linear fits for the declining phase of solar cycle 24 (blue, SOL &lt; 2600) and the rising phase of cycle 25 (red, SOL ≥ 2600) show a significantly steeper slope during the rise (Table 4).</w:t>
+        <w:t>Figure 7. Left: R² of the dose-rate regression against the Oulu neutron monitor count rate (27-sol smoothed) as a function of lag, detector E; the peak (best fit) sits within 10 sols of zero, indistinguishable from an instantaneous response. Right: hysteresis loop -- dose rate (detector E) plotted against the neutron monitor count rate (387-sol smoothed, at the best-fit lag), colored by SOL; separate linear fits for the declining phase of solar cycle 24 (blue, SOL &lt; 2600) and the rising phase of cycle 25 (red, SOL ≥ 2600) show a significantly steeper slope during the rise (Table 4).</w:t>
       </w:r>
     </w:p>
     <w:p>
@@ -9270,7 +9329,7 @@
           <wp:inline distT="0" distB="0" distL="0" distR="0">
             <wp:extent cx="5669280" cy="2543175"/>
             <wp:effectExtent l="0" t="0" r="0" b="0"/>
-            <wp:docPr id="10" name="Picture 13"/>
+            <wp:docPr id="9" name="Picture 13"/>
             <wp:cNvGraphicFramePr>
               <a:graphicFrameLocks xmlns:a="http://schemas.openxmlformats.org/drawingml/2006/main" noChangeAspect="1"/>
             </wp:cNvGraphicFramePr>
@@ -9278,13 +9337,13 @@
               <a:graphicData uri="http://schemas.openxmlformats.org/drawingml/2006/picture">
                 <pic:pic xmlns:pic="http://schemas.openxmlformats.org/drawingml/2006/picture">
                   <pic:nvPicPr>
-                    <pic:cNvPr id="10" name="Picture 13"/>
+                    <pic:cNvPr id="9" name="Picture 13"/>
                     <pic:cNvPicPr>
                       <a:picLocks noChangeAspect="1" noChangeArrowheads="1"/>
                     </pic:cNvPicPr>
                   </pic:nvPicPr>
                   <pic:blipFill>
-                    <a:blip r:embed="rId11"/>
+                    <a:blip r:embed="rId10"/>
                     <a:stretch>
                       <a:fillRect/>
                     </a:stretch>
@@ -9314,7 +9373,7 @@
       </w:pPr>
       <w:r>
         <w:rPr/>
-        <w:t>Figure 9. Lomb-Scargle periodogram (detector E) of the neutron-monitor regression residual, periods 4-1,500 sols. Dashed gray lines mark scan-corrected false-alarm-probability thresholds for peaks found by scanning; the single, pre-specified annual frequency (red dotted line) sits at the noise floor (FAP = 1.00 for detector E, 0.99 for detector B, evaluated without a scan correction, since it is one externally motivated hypothesis rather than a peak found by searching). The rise toward the longest periods scanned reflects imperfect linear detrending of the secular trend, not periodicity.</w:t>
+        <w:t>Figure 8. Lomb-Scargle periodogram (detector E) of the neutron-monitor regression residual, periods 4-1,500 sols. Dashed gray lines mark scan-corrected false-alarm-probability thresholds for peaks found by scanning; the single, pre-specified annual frequency (red dotted line) sits at the noise floor (FAP = 1.00 for detector E, 0.99 for detector B, evaluated without a scan correction, since it is one externally motivated hypothesis rather than a peak found by searching). The rise toward the longest periods scanned reflects imperfect linear detrending of the secular trend, not periodicity.</w:t>
       </w:r>
     </w:p>
     <w:sectPr>
@@ -9907,7 +9966,7 @@
       <w:spacing w:before="240" w:after="120"/>
     </w:pPr>
     <w:rPr>
-      <w:rFonts w:ascii="Liberation Sans" w:hAnsi="Liberation Sans" w:eastAsia="Microsoft YaHei" w:cs="Arial"/>
+      <w:rFonts w:ascii="Liberation Sans" w:hAnsi="Liberation Sans" w:eastAsia="Microsoft YaHei" w:cs="Lucida Sans"/>
       <w:sz w:val="28"/>
       <w:szCs w:val="28"/>
     </w:rPr>
@@ -9952,7 +10011,8 @@
       <w:suppressLineNumbers/>
     </w:pPr>
     <w:rPr>
-      <w:rFonts w:cs="Arial"/>
+      <w:rFonts w:cs="Lucida Sans"/>
+      <w:lang w:val="zxx" w:eastAsia="zxx" w:bidi="zxx"/>
     </w:rPr>
   </w:style>
   <w:style w:type="paragraph" w:styleId="Ttulouser">
@@ -9965,7 +10025,7 @@
       <w:spacing w:before="240" w:after="120"/>
     </w:pPr>
     <w:rPr>
-      <w:rFonts w:ascii="Liberation Sans" w:hAnsi="Liberation Sans" w:eastAsia="Microsoft YaHei" w:cs="Lucida Sans"/>
+      <w:rFonts w:ascii="Liberation Sans" w:hAnsi="Liberation Sans" w:eastAsia="Microsoft YaHei" w:cs="Arial"/>
       <w:sz w:val="28"/>
       <w:szCs w:val="28"/>
     </w:rPr>
@@ -9978,8 +10038,7 @@
       <w:suppressLineNumbers/>
     </w:pPr>
     <w:rPr>
-      <w:rFonts w:cs="Lucida Sans"/>
-      <w:lang w:val="zxx" w:eastAsia="zxx" w:bidi="zxx"/>
+      <w:rFonts w:cs="Arial"/>
     </w:rPr>
   </w:style>
   <w:style w:type="paragraph" w:styleId="Title">
@@ -10049,11 +10108,15 @@
       <w:lang w:val="pt-BR"/>
     </w:rPr>
   </w:style>
-  <w:style w:type="numbering" w:styleId="Semlista" w:default="1">
-    <w:name w:val="Sem lista"/>
+  <w:style w:type="numbering" w:styleId="Semlistauser" w:default="1">
+    <w:name w:val="Sem lista (user)"/>
     <w:uiPriority w:val="99"/>
     <w:semiHidden/>
     <w:unhideWhenUsed/>
+    <w:qFormat/>
+  </w:style>
+  <w:style w:type="numbering" w:styleId="Semlista">
+    <w:name w:val="Sem lista"/>
     <w:qFormat/>
   </w:style>
   <w:style w:type="table" w:default="1" w:styleId="Tabelanormal">

</xml_diff>